<commit_message>
Split: wider side margins on paper (24 mm) in the PDF and Word
Co-Authored-By: Claude Opus 5.5 (1M context) <noreply@anthropic.com>
Claude-Session: https://claude.ai/code/session_01LpdTShpagecXRA6vKNd5nC
</commit_message>
<xml_diff>
--- a/templates/split.docx
+++ b/templates/split.docx
@@ -14,8 +14,8 @@
         <w:tblLook w:firstColumn="1" w:firstRow="1" w:lastColumn="0" w:lastRow="0" w:noHBand="0" w:noVBand="1" w:val="04A0"/>
       </w:tblPr>
       <w:tblGrid>
-        <w:gridCol w:w="2608"/>
-        <w:gridCol w:w="5896"/>
+        <w:gridCol w:w="3061"/>
+        <w:gridCol w:w="5443"/>
         <w:gridCol w:w="3402"/>
       </w:tblGrid>
       <w:tr>
@@ -24,10 +24,10 @@
         </w:trPr>
         <w:tc>
           <w:tcPr>
-            <w:tcW w:type="dxa" w:w="2608"/>
+            <w:tcW w:type="dxa" w:w="3061"/>
             <w:tcMar>
               <w:top w:w="623" w:type="dxa"/>
-              <w:left w:w="907" w:type="dxa"/>
+              <w:left w:w="1360" w:type="dxa"/>
               <w:bottom w:w="0" w:type="dxa"/>
               <w:right w:w="0" w:type="dxa"/>
             </w:tcMar>
@@ -43,7 +43,7 @@
         </w:tc>
         <w:tc>
           <w:tcPr>
-            <w:tcW w:type="dxa" w:w="5896"/>
+            <w:tcW w:type="dxa" w:w="5443"/>
             <w:tcMar>
               <w:top w:w="623" w:type="dxa"/>
               <w:left w:w="170" w:type="dxa"/>
@@ -76,7 +76,7 @@
               <w:top w:w="623" w:type="dxa"/>
               <w:left w:w="226" w:type="dxa"/>
               <w:bottom w:w="0" w:type="dxa"/>
-              <w:right w:w="907" w:type="dxa"/>
+              <w:right w:w="1360" w:type="dxa"/>
             </w:tcMar>
             <w:vAlign w:val="center"/>
           </w:tcPr>
@@ -103,9 +103,9 @@
             </w:tcBorders>
             <w:tcMar>
               <w:top w:w="226" w:type="dxa"/>
-              <w:left w:w="907" w:type="dxa"/>
+              <w:left w:w="1360" w:type="dxa"/>
               <w:bottom w:w="0" w:type="dxa"/>
-              <w:right w:w="907" w:type="dxa"/>
+              <w:right w:w="1360" w:type="dxa"/>
             </w:tcMar>
           </w:tcPr>
           <w:p>
@@ -144,9 +144,9 @@
             <w:tcW w:type="dxa" w:w="11906"/>
             <w:tcMar>
               <w:top w:w="510" w:type="dxa"/>
-              <w:left w:w="907" w:type="dxa"/>
+              <w:left w:w="1360" w:type="dxa"/>
               <w:bottom w:w="0" w:type="dxa"/>
-              <w:right w:w="907" w:type="dxa"/>
+              <w:right w:w="1360" w:type="dxa"/>
             </w:tcMar>
           </w:tcPr>
           <w:p/>

</xml_diff>

<commit_message>
Split: 30 mm side margins in the PDF and Word
Co-Authored-By: Claude Sonnet 5.5 <noreply@anthropic.com>
Claude-Session: https://claude.ai/code/session_01LpdTShpagecXRA6vKNd5nC
</commit_message>
<xml_diff>
--- a/templates/split.docx
+++ b/templates/split.docx
@@ -14,8 +14,8 @@
         <w:tblLook w:firstColumn="1" w:firstRow="1" w:lastColumn="0" w:lastRow="0" w:noHBand="0" w:noVBand="1" w:val="04A0"/>
       </w:tblPr>
       <w:tblGrid>
-        <w:gridCol w:w="3061"/>
-        <w:gridCol w:w="5443"/>
+        <w:gridCol w:w="3402"/>
+        <w:gridCol w:w="5102"/>
         <w:gridCol w:w="3402"/>
       </w:tblGrid>
       <w:tr>
@@ -24,10 +24,10 @@
         </w:trPr>
         <w:tc>
           <w:tcPr>
-            <w:tcW w:type="dxa" w:w="3061"/>
+            <w:tcW w:type="dxa" w:w="3402"/>
             <w:tcMar>
               <w:top w:w="623" w:type="dxa"/>
-              <w:left w:w="1360" w:type="dxa"/>
+              <w:left w:w="1701" w:type="dxa"/>
               <w:bottom w:w="0" w:type="dxa"/>
               <w:right w:w="0" w:type="dxa"/>
             </w:tcMar>
@@ -43,7 +43,7 @@
         </w:tc>
         <w:tc>
           <w:tcPr>
-            <w:tcW w:type="dxa" w:w="5443"/>
+            <w:tcW w:type="dxa" w:w="5102"/>
             <w:tcMar>
               <w:top w:w="623" w:type="dxa"/>
               <w:left w:w="170" w:type="dxa"/>
@@ -76,7 +76,7 @@
               <w:top w:w="623" w:type="dxa"/>
               <w:left w:w="226" w:type="dxa"/>
               <w:bottom w:w="0" w:type="dxa"/>
-              <w:right w:w="1360" w:type="dxa"/>
+              <w:right w:w="1701" w:type="dxa"/>
             </w:tcMar>
             <w:vAlign w:val="center"/>
           </w:tcPr>
@@ -103,9 +103,9 @@
             </w:tcBorders>
             <w:tcMar>
               <w:top w:w="226" w:type="dxa"/>
-              <w:left w:w="1360" w:type="dxa"/>
+              <w:left w:w="1701" w:type="dxa"/>
               <w:bottom w:w="0" w:type="dxa"/>
-              <w:right w:w="1360" w:type="dxa"/>
+              <w:right w:w="1701" w:type="dxa"/>
             </w:tcMar>
           </w:tcPr>
           <w:p>
@@ -144,9 +144,9 @@
             <w:tcW w:type="dxa" w:w="11906"/>
             <w:tcMar>
               <w:top w:w="510" w:type="dxa"/>
-              <w:left w:w="1360" w:type="dxa"/>
+              <w:left w:w="1701" w:type="dxa"/>
               <w:bottom w:w="0" w:type="dxa"/>
-              <w:right w:w="1360" w:type="dxa"/>
+              <w:right w:w="1701" w:type="dxa"/>
             </w:tcMar>
           </w:tcPr>
           <w:p/>

</xml_diff>

<commit_message>
Round photo in Word too, and a crop centered exactly on the OpenCV face center
Co-Authored-By: Claude Sonnet 5.5 <noreply@anthropic.com>
Claude-Session: https://claude.ai/code/session_01LpdTShpagecXRA6vKNd5nC
</commit_message>
<xml_diff>
--- a/templates/split.docx
+++ b/templates/split.docx
@@ -37,7 +37,7 @@
               <w:pStyle w:val="CVPhoto"/>
             </w:pPr>
             <w:r>
-              <w:t>{Photo 2.8}</w:t>
+              <w:t>{Photo 2.8 round}</w:t>
             </w:r>
           </w:p>
         </w:tc>
@@ -46,7 +46,7 @@
             <w:tcW w:type="dxa" w:w="5102"/>
             <w:tcMar>
               <w:top w:w="623" w:type="dxa"/>
-              <w:left w:w="170" w:type="dxa"/>
+              <w:left w:w="396" w:type="dxa"/>
               <w:bottom w:w="0" w:type="dxa"/>
               <w:right w:w="226" w:type="dxa"/>
             </w:tcMar>

</xml_diff>

<commit_message>
Split: 45 mm side margins in the PDF and Word, band adjusted to fit
</commit_message>
<xml_diff>
--- a/templates/split.docx
+++ b/templates/split.docx
@@ -14,9 +14,9 @@
         <w:tblLook w:firstColumn="1" w:firstRow="1" w:lastColumn="0" w:lastRow="0" w:noHBand="0" w:noVBand="1" w:val="04A0"/>
       </w:tblPr>
       <w:tblGrid>
-        <w:gridCol w:w="3402"/>
-        <w:gridCol w:w="5102"/>
-        <w:gridCol w:w="3402"/>
+        <w:gridCol w:w="4195"/>
+        <w:gridCol w:w="3855"/>
+        <w:gridCol w:w="3855"/>
       </w:tblGrid>
       <w:tr>
         <w:trPr>
@@ -24,10 +24,10 @@
         </w:trPr>
         <w:tc>
           <w:tcPr>
-            <w:tcW w:type="dxa" w:w="3402"/>
+            <w:tcW w:type="dxa" w:w="4195"/>
             <w:tcMar>
               <w:top w:w="623" w:type="dxa"/>
-              <w:left w:w="1701" w:type="dxa"/>
+              <w:left w:w="2551" w:type="dxa"/>
               <w:bottom w:w="0" w:type="dxa"/>
               <w:right w:w="0" w:type="dxa"/>
             </w:tcMar>
@@ -43,12 +43,12 @@
         </w:tc>
         <w:tc>
           <w:tcPr>
-            <w:tcW w:type="dxa" w:w="5102"/>
+            <w:tcW w:type="dxa" w:w="3855"/>
             <w:tcMar>
               <w:top w:w="623" w:type="dxa"/>
-              <w:left w:w="396" w:type="dxa"/>
+              <w:left w:w="283" w:type="dxa"/>
               <w:bottom w:w="0" w:type="dxa"/>
-              <w:right w:w="226" w:type="dxa"/>
+              <w:right w:w="113" w:type="dxa"/>
             </w:tcMar>
             <w:vAlign w:val="center"/>
           </w:tcPr>
@@ -71,12 +71,12 @@
         </w:tc>
         <w:tc>
           <w:tcPr>
-            <w:tcW w:type="dxa" w:w="3402"/>
+            <w:tcW w:type="dxa" w:w="3855"/>
             <w:tcMar>
               <w:top w:w="623" w:type="dxa"/>
               <w:left w:w="226" w:type="dxa"/>
               <w:bottom w:w="0" w:type="dxa"/>
-              <w:right w:w="1701" w:type="dxa"/>
+              <w:right w:w="2551" w:type="dxa"/>
             </w:tcMar>
             <w:vAlign w:val="center"/>
           </w:tcPr>
@@ -103,9 +103,9 @@
             </w:tcBorders>
             <w:tcMar>
               <w:top w:w="226" w:type="dxa"/>
-              <w:left w:w="1701" w:type="dxa"/>
+              <w:left w:w="2551" w:type="dxa"/>
               <w:bottom w:w="0" w:type="dxa"/>
-              <w:right w:w="1701" w:type="dxa"/>
+              <w:right w:w="2551" w:type="dxa"/>
             </w:tcMar>
           </w:tcPr>
           <w:p>
@@ -144,9 +144,9 @@
             <w:tcW w:type="dxa" w:w="11906"/>
             <w:tcMar>
               <w:top w:w="510" w:type="dxa"/>
-              <w:left w:w="1701" w:type="dxa"/>
+              <w:left w:w="2551" w:type="dxa"/>
               <w:bottom w:w="0" w:type="dxa"/>
-              <w:right w:w="1701" w:type="dxa"/>
+              <w:right w:w="2551" w:type="dxa"/>
             </w:tcMar>
           </w:tcPr>
           <w:p/>

</xml_diff>

<commit_message>
fix(split): band in the body, so Word doesn't dim it
Word fades header content while the body is edited; the band was a first-page header shape and showed grey. It is anchored in a paragraph before the band's table (inside a cell, Word 2013+ lays it out in the cell).
</commit_message>
<xml_diff>
--- a/templates/split.docx
+++ b/templates/split.docx
@@ -2,6 +2,52 @@
 <file path=word/document.xml><?xml version="1.0" encoding="utf-8"?>
 <w:document xmlns:wpc="http://schemas.microsoft.com/office/word/2010/wordprocessingCanvas" xmlns:mo="http://schemas.microsoft.com/office/mac/office/2008/main" xmlns:mc="http://schemas.openxmlformats.org/markup-compatibility/2006" xmlns:mv="urn:schemas-microsoft-com:mac:vml" xmlns:o="urn:schemas-microsoft-com:office:office" xmlns:r="http://schemas.openxmlformats.org/officeDocument/2006/relationships" xmlns:m="http://schemas.openxmlformats.org/officeDocument/2006/math" xmlns:v="urn:schemas-microsoft-com:vml" xmlns:wp14="http://schemas.microsoft.com/office/word/2010/wordprocessingDrawing" xmlns:wp="http://schemas.openxmlformats.org/drawingml/2006/wordprocessingDrawing" xmlns:w10="urn:schemas-microsoft-com:office:word" xmlns:w="http://schemas.openxmlformats.org/wordprocessingml/2006/main" xmlns:w14="http://schemas.microsoft.com/office/word/2010/wordml" xmlns:wpg="http://schemas.microsoft.com/office/word/2010/wordprocessingGroup" xmlns:wpi="http://schemas.microsoft.com/office/word/2010/wordprocessingInk" xmlns:wne="http://schemas.microsoft.com/office/word/2006/wordml" xmlns:wps="http://schemas.microsoft.com/office/word/2010/wordprocessingShape" mc:Ignorable="w14 wp14">
   <w:body>
+    <w:p>
+      <w:pPr>
+        <w:pStyle w:val="CVPhoto"/>
+      </w:pPr>
+      <w:r xmlns:a="http://schemas.openxmlformats.org/drawingml/2006/main">
+        <w:drawing>
+          <wp:anchor distT="0" distB="0" distL="0" distR="0" simplePos="0" relativeHeight="1001" behindDoc="1" locked="1" layoutInCell="0" allowOverlap="1">
+            <wp:simplePos x="0" y="0"/>
+            <wp:positionH relativeFrom="page">
+              <wp:posOffset>0</wp:posOffset>
+            </wp:positionH>
+            <wp:positionV relativeFrom="page">
+              <wp:posOffset>0</wp:posOffset>
+            </wp:positionV>
+            <wp:extent cx="7560000" cy="2448000"/>
+            <wp:effectExtent l="0" t="0" r="0" b="0"/>
+            <wp:wrapNone/>
+            <wp:docPr id="1001" name="Shape 1001"/>
+            <wp:cNvGraphicFramePr/>
+            <a:graphic>
+              <a:graphicData uri="http://schemas.microsoft.com/office/word/2010/wordprocessingShape">
+                <wps:wsp>
+                  <wps:cNvSpPr/>
+                  <wps:spPr>
+                    <a:xfrm>
+                      <a:off x="0" y="0"/>
+                      <a:ext cx="7560000" cy="2448000"/>
+                    </a:xfrm>
+                    <a:prstGeom prst="rect">
+                      <a:avLst/>
+                    </a:prstGeom>
+                    <a:solidFill>
+                      <a:srgbClr val="0F172A"/>
+                    </a:solidFill>
+                    <a:ln>
+                      <a:noFill/>
+                    </a:ln>
+                  </wps:spPr>
+                  <wps:bodyPr/>
+                </wps:wsp>
+              </a:graphicData>
+            </a:graphic>
+          </wp:anchor>
+        </w:drawing>
+      </w:r>
+    </w:p>
     <w:tbl>
       <w:tblPr>
         <w:tblW w:type="auto" w:w="0"/>
@@ -182,47 +228,6 @@
     <w:pPr>
       <w:pStyle w:val="CVPhoto"/>
     </w:pPr>
-    <w:r xmlns:a="http://schemas.openxmlformats.org/drawingml/2006/main">
-      <w:drawing>
-        <wp:anchor distT="0" distB="0" distL="0" distR="0" simplePos="0" relativeHeight="1001" behindDoc="1" locked="1" layoutInCell="0" allowOverlap="1">
-          <wp:simplePos x="0" y="0"/>
-          <wp:positionH relativeFrom="page">
-            <wp:posOffset>0</wp:posOffset>
-          </wp:positionH>
-          <wp:positionV relativeFrom="page">
-            <wp:posOffset>0</wp:posOffset>
-          </wp:positionV>
-          <wp:extent cx="7560000" cy="2448000"/>
-          <wp:effectExtent l="0" t="0" r="0" b="0"/>
-          <wp:wrapNone/>
-          <wp:docPr id="1001" name="Shape 1001"/>
-          <wp:cNvGraphicFramePr/>
-          <a:graphic>
-            <a:graphicData uri="http://schemas.microsoft.com/office/word/2010/wordprocessingShape">
-              <wps:wsp>
-                <wps:cNvSpPr/>
-                <wps:spPr>
-                  <a:xfrm>
-                    <a:off x="0" y="0"/>
-                    <a:ext cx="7560000" cy="2448000"/>
-                  </a:xfrm>
-                  <a:prstGeom prst="rect">
-                    <a:avLst/>
-                  </a:prstGeom>
-                  <a:solidFill>
-                    <a:srgbClr val="0F172A"/>
-                  </a:solidFill>
-                  <a:ln>
-                    <a:noFill/>
-                  </a:ln>
-                </wps:spPr>
-                <wps:bodyPr/>
-              </wps:wsp>
-            </a:graphicData>
-          </a:graphic>
-        </wp:anchor>
-      </w:drawing>
-    </w:r>
   </w:p>
 </w:hdr>
 </file>

</xml_diff>

<commit_message>
feat(split): Space Grotesk, and a marker stroke behind bold on screen
Print and Word keep plain bold.
</commit_message>
<xml_diff>
--- a/templates/split.docx
+++ b/templates/split.docx
@@ -625,10 +625,10 @@
     <w:rsid w:val="00FC693F"/>
     <w:pPr>
       <w:keepNext w:val="0"/>
-      <w:spacing w:before="0" w:after="120" w:line="298" w:lineRule="auto"/>
+      <w:spacing w:before="0" w:after="120" w:line="282" w:lineRule="auto"/>
     </w:pPr>
     <w:rPr>
-      <w:rFonts w:ascii="Inter" w:hAnsi="Inter" w:eastAsia="Inter"/>
+      <w:rFonts w:ascii="Space Grotesk" w:hAnsi="Space Grotesk" w:eastAsia="Space Grotesk"/>
       <w:b w:val="0"/>
       <w:i w:val="0"/>
       <w:caps w:val="0"/>
@@ -694,11 +694,11 @@
       <w:pBdr>
         <w:bottom w:val="single" w:sz="4" w:space="3" w:color="CBD5E1"/>
       </w:pBdr>
-      <w:spacing w:before="0" w:after="140" w:line="298" w:lineRule="auto"/>
+      <w:spacing w:before="0" w:after="140" w:line="282" w:lineRule="auto"/>
       <w:outlineLvl w:val="0"/>
     </w:pPr>
     <w:rPr>
-      <w:rFonts w:ascii="Inter Bold" w:hAnsi="Inter Bold" w:eastAsia="Inter Bold" w:cs="Inter Bold"/>
+      <w:rFonts w:ascii="Space Grotesk Bold" w:hAnsi="Space Grotesk Bold" w:eastAsia="Space Grotesk Bold" w:cs="Space Grotesk Bold"/>
       <w:i w:val="0"/>
       <w:caps/>
       <w:color w:val="0F766E"/>
@@ -719,11 +719,11 @@
     <w:pPr>
       <w:keepNext/>
       <w:keepLines/>
-      <w:spacing w:before="120" w:after="0" w:line="298" w:lineRule="auto"/>
+      <w:spacing w:before="120" w:after="0" w:line="282" w:lineRule="auto"/>
       <w:outlineLvl w:val="1"/>
     </w:pPr>
     <w:rPr>
-      <w:rFonts w:ascii="Inter Bold" w:hAnsi="Inter Bold" w:eastAsia="Inter Bold" w:cs="Inter Bold"/>
+      <w:rFonts w:ascii="Space Grotesk Bold" w:hAnsi="Space Grotesk Bold" w:eastAsia="Space Grotesk Bold" w:cs="Space Grotesk Bold"/>
       <w:i w:val="0"/>
       <w:caps w:val="0"/>
       <w:color w:val="0F172A"/>
@@ -746,11 +746,11 @@
       <w:pBdr>
         <w:bottom w:val="single" w:sz="4" w:space="3" w:color="CBD5E1"/>
       </w:pBdr>
-      <w:spacing w:before="0" w:after="140" w:line="298" w:lineRule="auto"/>
+      <w:spacing w:before="0" w:after="140" w:line="282" w:lineRule="auto"/>
       <w:outlineLvl w:val="2"/>
     </w:pPr>
     <w:rPr>
-      <w:rFonts w:ascii="Inter Bold" w:hAnsi="Inter Bold" w:eastAsia="Inter Bold" w:cs="Inter Bold"/>
+      <w:rFonts w:ascii="Space Grotesk Bold" w:hAnsi="Space Grotesk Bold" w:eastAsia="Space Grotesk Bold" w:cs="Space Grotesk Bold"/>
       <w:i w:val="0"/>
       <w:caps/>
       <w:color w:val="0F766E"/>
@@ -771,11 +771,11 @@
     <w:pPr>
       <w:keepNext/>
       <w:keepLines/>
-      <w:spacing w:before="80" w:after="0" w:line="298" w:lineRule="auto"/>
+      <w:spacing w:before="80" w:after="0" w:line="282" w:lineRule="auto"/>
       <w:outlineLvl w:val="3"/>
     </w:pPr>
     <w:rPr>
-      <w:rFonts w:ascii="Inter" w:hAnsi="Inter" w:eastAsia="Inter"/>
+      <w:rFonts w:ascii="Space Grotesk" w:hAnsi="Space Grotesk" w:eastAsia="Space Grotesk"/>
       <w:b w:val="0"/>
       <w:bCs/>
       <w:i w:val="0"/>
@@ -1066,12 +1066,12 @@
     <w:rsid w:val="00FC693F"/>
     <w:pPr>
       <w:keepNext w:val="0"/>
-      <w:spacing w:before="0" w:after="40" w:line="298" w:lineRule="auto"/>
+      <w:spacing w:before="0" w:after="40" w:line="282" w:lineRule="auto"/>
       <w:ind w:left="720"/>
       <w:contextualSpacing/>
     </w:pPr>
     <w:rPr>
-      <w:rFonts w:ascii="Inter" w:hAnsi="Inter" w:eastAsia="Inter"/>
+      <w:rFonts w:ascii="Space Grotesk" w:hAnsi="Space Grotesk" w:eastAsia="Space Grotesk"/>
       <w:b w:val="0"/>
       <w:i w:val="0"/>
       <w:caps w:val="0"/>
@@ -1448,7 +1448,7 @@
       <w:spacing w:line="240" w:lineRule="auto"/>
     </w:pPr>
     <w:rPr>
-      <w:rFonts w:ascii="Inter Bold" w:hAnsi="Inter Bold" w:eastAsia="Inter Bold" w:cs="Inter Bold"/>
+      <w:rFonts w:ascii="Space Grotesk Bold" w:hAnsi="Space Grotesk Bold" w:eastAsia="Space Grotesk Bold" w:cs="Space Grotesk Bold"/>
       <w:color w:val="4F81BD" w:themeColor="accent1"/>
       <w:sz w:val="18"/>
       <w:szCs w:val="18"/>
@@ -1492,7 +1492,7 @@
       <w:ind w:left="936" w:right="936"/>
     </w:pPr>
     <w:rPr>
-      <w:rFonts w:ascii="Inter Bold" w:hAnsi="Inter Bold" w:eastAsia="Inter Bold" w:cs="Inter Bold"/>
+      <w:rFonts w:ascii="Space Grotesk Bold" w:hAnsi="Space Grotesk Bold" w:eastAsia="Space Grotesk Bold" w:cs="Space Grotesk Bold"/>
       <w:i/>
       <w:iCs/>
       <w:color w:val="4F81BD" w:themeColor="accent1"/>
@@ -12343,10 +12343,10 @@
     <w:basedOn w:val="Normal"/>
     <w:pPr>
       <w:keepNext w:val="0"/>
-      <w:spacing w:before="0" w:after="0" w:line="218" w:lineRule="auto"/>
+      <w:spacing w:before="0" w:after="0" w:line="207" w:lineRule="auto"/>
     </w:pPr>
     <w:rPr>
-      <w:rFonts w:ascii="Inter Bold" w:hAnsi="Inter Bold" w:eastAsia="Inter Bold" w:cs="Inter Bold"/>
+      <w:rFonts w:ascii="Space Grotesk Bold" w:hAnsi="Space Grotesk Bold" w:eastAsia="Space Grotesk Bold" w:cs="Space Grotesk Bold"/>
       <w:i w:val="0"/>
       <w:caps w:val="0"/>
       <w:color w:val="F1F5F9"/>
@@ -12359,10 +12359,10 @@
     <w:basedOn w:val="Normal"/>
     <w:pPr>
       <w:keepNext w:val="0"/>
-      <w:spacing w:before="60" w:after="0" w:line="298" w:lineRule="auto"/>
+      <w:spacing w:before="60" w:after="0" w:line="282" w:lineRule="auto"/>
     </w:pPr>
     <w:rPr>
-      <w:rFonts w:ascii="Inter" w:hAnsi="Inter" w:eastAsia="Inter"/>
+      <w:rFonts w:ascii="Space Grotesk" w:hAnsi="Space Grotesk" w:eastAsia="Space Grotesk"/>
       <w:b w:val="0"/>
       <w:i w:val="0"/>
       <w:caps/>
@@ -12379,7 +12379,7 @@
       <w:spacing w:before="0" w:after="0" w:line="240" w:lineRule="auto"/>
     </w:pPr>
     <w:rPr>
-      <w:rFonts w:ascii="Inter" w:hAnsi="Inter" w:eastAsia="Inter"/>
+      <w:rFonts w:ascii="Space Grotesk" w:hAnsi="Space Grotesk" w:eastAsia="Space Grotesk"/>
       <w:b w:val="0"/>
       <w:i w:val="0"/>
       <w:caps w:val="0"/>
@@ -12392,11 +12392,11 @@
     <w:basedOn w:val="Normal"/>
     <w:pPr>
       <w:keepNext w:val="0"/>
-      <w:spacing w:before="0" w:after="40" w:line="238" w:lineRule="auto"/>
+      <w:spacing w:before="0" w:after="40" w:line="226" w:lineRule="auto"/>
       <w:jc w:val="right"/>
     </w:pPr>
     <w:rPr>
-      <w:rFonts w:ascii="Inter" w:hAnsi="Inter" w:eastAsia="Inter"/>
+      <w:rFonts w:ascii="Space Grotesk" w:hAnsi="Space Grotesk" w:eastAsia="Space Grotesk"/>
       <w:b w:val="0"/>
       <w:i w:val="0"/>
       <w:caps w:val="0"/>
@@ -12409,10 +12409,10 @@
     <w:basedOn w:val="Normal"/>
     <w:pPr>
       <w:keepNext w:val="0"/>
-      <w:spacing w:before="0" w:after="0" w:line="298" w:lineRule="auto"/>
+      <w:spacing w:before="0" w:after="0" w:line="282" w:lineRule="auto"/>
     </w:pPr>
     <w:rPr>
-      <w:rFonts w:ascii="Inter" w:hAnsi="Inter" w:eastAsia="Inter"/>
+      <w:rFonts w:ascii="Space Grotesk" w:hAnsi="Space Grotesk" w:eastAsia="Space Grotesk"/>
       <w:b w:val="0"/>
       <w:i w:val="0"/>
       <w:caps w:val="0"/>
@@ -12425,10 +12425,10 @@
     <w:basedOn w:val="Normal"/>
     <w:pPr>
       <w:keepNext w:val="0"/>
-      <w:spacing w:before="0" w:after="0" w:line="218" w:lineRule="auto"/>
+      <w:spacing w:before="0" w:after="0" w:line="207" w:lineRule="auto"/>
     </w:pPr>
     <w:rPr>
-      <w:rFonts w:ascii="Inter Bold" w:hAnsi="Inter Bold" w:eastAsia="Inter Bold" w:cs="Inter Bold"/>
+      <w:rFonts w:ascii="Space Grotesk Bold" w:hAnsi="Space Grotesk Bold" w:eastAsia="Space Grotesk Bold" w:cs="Space Grotesk Bold"/>
       <w:i w:val="0"/>
       <w:caps w:val="0"/>
       <w:color w:val="5EEAD4"/>
@@ -12440,10 +12440,10 @@
     <w:basedOn w:val="Normal"/>
     <w:pPr>
       <w:keepNext w:val="0"/>
-      <w:spacing w:before="0" w:after="0" w:line="258" w:lineRule="auto"/>
+      <w:spacing w:before="0" w:after="0" w:line="245" w:lineRule="auto"/>
     </w:pPr>
     <w:rPr>
-      <w:rFonts w:ascii="Inter" w:hAnsi="Inter" w:eastAsia="Inter"/>
+      <w:rFonts w:ascii="Space Grotesk" w:hAnsi="Space Grotesk" w:eastAsia="Space Grotesk"/>
       <w:b w:val="0"/>
       <w:i w:val="0"/>
       <w:caps w:val="0"/>
@@ -12456,10 +12456,10 @@
     <w:basedOn w:val="Normal"/>
     <w:pPr>
       <w:keepNext/>
-      <w:spacing w:before="20" w:after="80" w:line="298" w:lineRule="auto"/>
+      <w:spacing w:before="20" w:after="80" w:line="282" w:lineRule="auto"/>
     </w:pPr>
     <w:rPr>
-      <w:rFonts w:ascii="Inter Bold" w:hAnsi="Inter Bold" w:eastAsia="Inter Bold" w:cs="Inter Bold"/>
+      <w:rFonts w:ascii="Space Grotesk Bold" w:hAnsi="Space Grotesk Bold" w:eastAsia="Space Grotesk Bold" w:cs="Space Grotesk Bold"/>
       <w:i w:val="0"/>
       <w:caps/>
       <w:color w:val="0F766E"/>
@@ -12472,10 +12472,10 @@
     <w:basedOn w:val="Normal"/>
     <w:pPr>
       <w:keepNext w:val="0"/>
-      <w:spacing w:before="0" w:after="20" w:line="298" w:lineRule="auto"/>
+      <w:spacing w:before="0" w:after="20" w:line="282" w:lineRule="auto"/>
     </w:pPr>
     <w:rPr>
-      <w:rFonts w:ascii="Inter" w:hAnsi="Inter" w:eastAsia="Inter"/>
+      <w:rFonts w:ascii="Space Grotesk" w:hAnsi="Space Grotesk" w:eastAsia="Space Grotesk"/>
       <w:b w:val="0"/>
       <w:i w:val="0"/>
       <w:caps w:val="0"/>
@@ -12491,10 +12491,10 @@
       <w:tabs>
         <w:tab w:pos="2551" w:val="left"/>
       </w:tabs>
-      <w:spacing w:before="0" w:after="20" w:line="298" w:lineRule="auto"/>
+      <w:spacing w:before="0" w:after="20" w:line="282" w:lineRule="auto"/>
     </w:pPr>
     <w:rPr>
-      <w:rFonts w:ascii="Inter" w:hAnsi="Inter" w:eastAsia="Inter"/>
+      <w:rFonts w:ascii="Space Grotesk" w:hAnsi="Space Grotesk" w:eastAsia="Space Grotesk"/>
       <w:b w:val="0"/>
       <w:i w:val="0"/>
       <w:caps w:val="0"/>
@@ -12507,10 +12507,10 @@
     <w:basedOn w:val="Normal"/>
     <w:pPr>
       <w:keepNext w:val="0"/>
-      <w:spacing w:before="80" w:after="160" w:line="377" w:lineRule="auto"/>
+      <w:spacing w:before="80" w:after="160" w:line="357" w:lineRule="auto"/>
     </w:pPr>
     <w:rPr>
-      <w:rFonts w:ascii="Inter" w:hAnsi="Inter" w:eastAsia="Inter"/>
+      <w:rFonts w:ascii="Space Grotesk" w:hAnsi="Space Grotesk" w:eastAsia="Space Grotesk"/>
       <w:b w:val="0"/>
       <w:i w:val="0"/>
       <w:caps w:val="0"/>
@@ -12523,10 +12523,10 @@
     <w:basedOn w:val="Normal"/>
     <w:pPr>
       <w:keepNext w:val="0"/>
-      <w:spacing w:before="0" w:after="40" w:line="377" w:lineRule="auto"/>
+      <w:spacing w:before="0" w:after="40" w:line="357" w:lineRule="auto"/>
     </w:pPr>
     <w:rPr>
-      <w:rFonts w:ascii="Inter" w:hAnsi="Inter" w:eastAsia="Inter"/>
+      <w:rFonts w:ascii="Space Grotesk" w:hAnsi="Space Grotesk" w:eastAsia="Space Grotesk"/>
       <w:b w:val="0"/>
       <w:i w:val="0"/>
       <w:caps w:val="0"/>
@@ -12542,10 +12542,10 @@
       <w:pBdr>
         <w:left w:val="single" w:sz="12" w:space="8" w:color="5EEAD4"/>
       </w:pBdr>
-      <w:spacing w:before="0" w:after="120" w:line="298" w:lineRule="auto"/>
+      <w:spacing w:before="0" w:after="120" w:line="282" w:lineRule="auto"/>
     </w:pPr>
     <w:rPr>
-      <w:rFonts w:ascii="Inter" w:hAnsi="Inter" w:eastAsia="Inter"/>
+      <w:rFonts w:ascii="Space Grotesk" w:hAnsi="Space Grotesk" w:eastAsia="Space Grotesk"/>
       <w:b w:val="0"/>
       <w:i/>
       <w:caps w:val="0"/>
@@ -12558,10 +12558,10 @@
     <w:basedOn w:val="Normal"/>
     <w:pPr>
       <w:keepNext w:val="0"/>
-      <w:spacing w:before="0" w:after="200" w:line="298" w:lineRule="auto"/>
+      <w:spacing w:before="0" w:after="200" w:line="282" w:lineRule="auto"/>
     </w:pPr>
     <w:rPr>
-      <w:rFonts w:ascii="Inter" w:hAnsi="Inter" w:eastAsia="Inter"/>
+      <w:rFonts w:ascii="Space Grotesk" w:hAnsi="Space Grotesk" w:eastAsia="Space Grotesk"/>
       <w:b w:val="0"/>
       <w:i w:val="0"/>
       <w:caps w:val="0"/>
@@ -12574,10 +12574,10 @@
     <w:basedOn w:val="Normal"/>
     <w:pPr>
       <w:keepNext w:val="0"/>
-      <w:spacing w:before="0" w:after="200" w:line="298" w:lineRule="auto"/>
+      <w:spacing w:before="0" w:after="200" w:line="282" w:lineRule="auto"/>
     </w:pPr>
     <w:rPr>
-      <w:rFonts w:ascii="Inter" w:hAnsi="Inter" w:eastAsia="Inter"/>
+      <w:rFonts w:ascii="Space Grotesk" w:hAnsi="Space Grotesk" w:eastAsia="Space Grotesk"/>
       <w:b w:val="0"/>
       <w:i w:val="0"/>
       <w:caps w:val="0"/>
@@ -12588,7 +12588,7 @@
   <w:style w:type="character" w:customStyle="1" w:styleId="CVAccent">
     <w:name w:val="CV Accent"/>
     <w:rPr>
-      <w:rFonts w:ascii="Inter" w:hAnsi="Inter"/>
+      <w:rFonts w:ascii="Space Grotesk" w:hAnsi="Space Grotesk"/>
       <w:color w:val="5EEAD4"/>
       <w:sz w:val="12"/>
     </w:rPr>
@@ -12596,14 +12596,14 @@
   <w:style w:type="character" w:customStyle="1" w:styleId="CVMuted">
     <w:name w:val="CV Muted"/>
     <w:rPr>
-      <w:rFonts w:ascii="Inter" w:hAnsi="Inter"/>
+      <w:rFonts w:ascii="Space Grotesk" w:hAnsi="Space Grotesk"/>
       <w:color w:val="94A3B8"/>
     </w:rPr>
   </w:style>
   <w:style w:type="character" w:customStyle="1" w:styleId="CVTool">
     <w:name w:val="CV Tool"/>
     <w:rPr>
-      <w:rFonts w:ascii="Inter" w:hAnsi="Inter"/>
+      <w:rFonts w:ascii="Space Grotesk" w:hAnsi="Space Grotesk"/>
       <w:color w:val="0F766E"/>
       <w:sz w:val="14"/>
       <w:shd w:val="clear" w:color="auto" w:fill="E6F2F1"/>
@@ -12612,7 +12612,7 @@
   <w:style w:type="character" w:customStyle="1" w:styleId="CVToolMark">
     <w:name w:val="CV Tool Mark"/>
     <w:rPr>
-      <w:rFonts w:ascii="Inter" w:hAnsi="Inter"/>
+      <w:rFonts w:ascii="Space Grotesk" w:hAnsi="Space Grotesk"/>
       <w:sz w:val="14"/>
       <w:shd w:val="clear" w:color="auto" w:fill="E6F2F1"/>
     </w:rPr>
@@ -12620,7 +12620,7 @@
   <w:style w:type="character" w:customStyle="1" w:styleId="CVStrong">
     <w:name w:val="CV Strong"/>
     <w:rPr>
-      <w:rFonts w:ascii="Inter Bold" w:hAnsi="Inter Bold"/>
+      <w:rFonts w:ascii="Space Grotesk Bold" w:hAnsi="Space Grotesk Bold"/>
     </w:rPr>
   </w:style>
 </w:styles>

</xml_diff>